<commit_message>
short word file - fixed pipeline
</commit_message>
<xml_diff>
--- a/short-package-guide.docx
+++ b/short-package-guide.docx
@@ -5,13 +5,23 @@
     <w:p>
       <w:pPr>
         <w:pStyle w:val="Title"/>
+        <w:rPr>
+          <w:u w:val="single"/>
+        </w:rPr>
       </w:pPr>
+      <w:bookmarkStart w:id="0" w:name="OLE_LINK2"/>
       <w:proofErr w:type="spellStart"/>
       <w:r>
+        <w:rPr>
+          <w:u w:val="single"/>
+        </w:rPr>
         <w:t>zeeg</w:t>
       </w:r>
       <w:proofErr w:type="spellEnd"/>
       <w:r>
+        <w:rPr>
+          <w:u w:val="single"/>
+        </w:rPr>
         <w:t>-detector: how the package is built</w:t>
       </w:r>
     </w:p>
@@ -39,10 +49,10 @@
     <w:p>
       <w:r>
         <w:drawing>
-          <wp:inline distT="0" distB="0" distL="0" distR="0" wp14:anchorId="508DFD8A" wp14:editId="7244697A">
-            <wp:extent cx="4646428" cy="2528646"/>
-            <wp:effectExtent l="0" t="0" r="1905" b="0"/>
-            <wp:docPr id="693591608" name="Picture 1"/>
+          <wp:inline distT="0" distB="0" distL="0" distR="0" wp14:anchorId="6527A2D8" wp14:editId="3C9F1767">
+            <wp:extent cx="4733925" cy="2641464"/>
+            <wp:effectExtent l="0" t="0" r="3175" b="635"/>
+            <wp:docPr id="45338137" name="Picture 1"/>
             <wp:cNvGraphicFramePr>
               <a:graphicFrameLocks xmlns:a="http://schemas.openxmlformats.org/drawingml/2006/main" noChangeAspect="1"/>
             </wp:cNvGraphicFramePr>
@@ -50,11 +60,11 @@
               <a:graphicData uri="http://schemas.openxmlformats.org/drawingml/2006/picture">
                 <pic:pic xmlns:pic="http://schemas.openxmlformats.org/drawingml/2006/picture">
                   <pic:nvPicPr>
-                    <pic:cNvPr id="693591608" name=""/>
+                    <pic:cNvPr id="45338137" name=""/>
                     <pic:cNvPicPr/>
                   </pic:nvPicPr>
                   <pic:blipFill>
-                    <a:blip r:embed="rId7"/>
+                    <a:blip r:embed="rId5"/>
                     <a:stretch>
                       <a:fillRect/>
                     </a:stretch>
@@ -62,7 +72,7 @@
                   <pic:spPr>
                     <a:xfrm>
                       <a:off x="0" y="0"/>
-                      <a:ext cx="4691052" cy="2552931"/>
+                      <a:ext cx="4787752" cy="2671499"/>
                     </a:xfrm>
                     <a:prstGeom prst="rect">
                       <a:avLst/>
@@ -81,7 +91,7 @@
           <w:noProof/>
         </w:rPr>
         <w:drawing>
-          <wp:inline distT="0" distB="0" distL="0" distR="0" wp14:anchorId="458F5F10" wp14:editId="283EB850">
+          <wp:inline distT="0" distB="0" distL="0" distR="0" wp14:anchorId="3E51A994" wp14:editId="5DE36077">
             <wp:extent cx="5943600" cy="1644770"/>
             <wp:effectExtent l="0" t="0" r="0" b="0"/>
             <wp:docPr id="1" name="Picture 1"/>
@@ -96,7 +106,7 @@
                     <pic:cNvPicPr/>
                   </pic:nvPicPr>
                   <pic:blipFill>
-                    <a:blip r:embed="rId8"/>
+                    <a:blip r:embed="rId6"/>
                     <a:stretch>
                       <a:fillRect/>
                     </a:stretch>
@@ -251,7 +261,7 @@
           <w:noProof/>
         </w:rPr>
         <w:drawing>
-          <wp:inline distT="0" distB="0" distL="0" distR="0" wp14:anchorId="7F7630FD" wp14:editId="27B9E634">
+          <wp:inline distT="0" distB="0" distL="0" distR="0" wp14:anchorId="76F89CEE" wp14:editId="3AA93F49">
             <wp:extent cx="5741582" cy="2589128"/>
             <wp:effectExtent l="0" t="0" r="0" b="1905"/>
             <wp:docPr id="2" name="Picture 2"/>
@@ -266,7 +276,7 @@
                     <pic:cNvPicPr/>
                   </pic:nvPicPr>
                   <pic:blipFill>
-                    <a:blip r:embed="rId9"/>
+                    <a:blip r:embed="rId7"/>
                     <a:stretch>
                       <a:fillRect/>
                     </a:stretch>
@@ -800,6 +810,7 @@
         </w:rPr>
         <w:t>Important: the scores measure agreement with the lab's offline method, not with spikes marked by a clinician.</w:t>
       </w:r>
+      <w:bookmarkEnd w:id="0"/>
     </w:p>
     <w:sectPr>
       <w:pgSz w:w="12240" w:h="15840"/>
@@ -811,62 +822,12 @@
 </w:document>
 </file>
 
-<file path=word/endnotes.xml><?xml version="1.0" encoding="utf-8"?>
-<w:endnotes xmlns:wpc="http://schemas.microsoft.com/office/word/2010/wordprocessingCanvas" xmlns:cx="http://schemas.microsoft.com/office/drawing/2014/chartex" xmlns:cx1="http://schemas.microsoft.com/office/drawing/2015/9/8/chartex" xmlns:cx2="http://schemas.microsoft.com/office/drawing/2015/10/21/chartex" xmlns:cx3="http://schemas.microsoft.com/office/drawing/2016/5/9/chartex" xmlns:cx4="http://schemas.microsoft.com/office/drawing/2016/5/10/chartex" xmlns:cx5="http://schemas.microsoft.com/office/drawing/2016/5/11/chartex" xmlns:cx6="http://schemas.microsoft.com/office/drawing/2016/5/12/chartex" xmlns:cx7="http://schemas.microsoft.com/office/drawing/2016/5/13/chartex" xmlns:cx8="http://schemas.microsoft.com/office/drawing/2016/5/14/chartex" xmlns:mc="http://schemas.openxmlformats.org/markup-compatibility/2006" xmlns:m="http://schemas.openxmlformats.org/officeDocument/2006/math" xmlns:aink="http://schemas.microsoft.com/office/drawing/2016/ink" xmlns:am3d="http://schemas.microsoft.com/office/drawing/2017/model3d" xmlns:oel="http://schemas.microsoft.com/office/2019/extlst" xmlns:r="http://schemas.openxmlformats.org/officeDocument/2006/relationships" xmlns:wp14="http://schemas.microsoft.com/office/word/2010/wordprocessingDrawing" xmlns:wp="http://schemas.openxmlformats.org/drawingml/2006/wordprocessingDrawing" xmlns:wpg="http://schemas.microsoft.com/office/word/2010/wordprocessingGroup" xmlns:wpi="http://schemas.microsoft.com/office/word/2010/wordprocessingInk" xmlns:wps="http://schemas.microsoft.com/office/word/2010/wordprocessingShape" xmlns:o="urn:schemas-microsoft-com:office:office" xmlns:v="urn:schemas-microsoft-com:vml" xmlns:w10="urn:schemas-microsoft-com:office:word" xmlns:w="http://schemas.openxmlformats.org/wordprocessingml/2006/main" xmlns:w14="http://schemas.microsoft.com/office/word/2010/wordml" xmlns:w15="http://schemas.microsoft.com/office/word/2012/wordml" xmlns:w16cex="http://schemas.microsoft.com/office/word/2018/wordml/cex" xmlns:w16cid="http://schemas.microsoft.com/office/word/2016/wordml/cid" xmlns:w16="http://schemas.microsoft.com/office/word/2018/wordml" xmlns:w16sdtdh="http://schemas.microsoft.com/office/word/2020/wordml/sdtdatahash" xmlns:w16sdtfl="http://schemas.microsoft.com/office/word/2024/wordml/sdtformatlock" xmlns:w16se="http://schemas.microsoft.com/office/word/2015/wordml/symex" xmlns:w16du="http://schemas.microsoft.com/office/word/2023/wordml/word16du" xmlns:wne="http://schemas.microsoft.com/office/word/2006/wordml" mc:Ignorable="w14 w15 w16se w16cid w16 w16cex w16sdtdh w16sdtfl w16du wp14">
-  <w:endnote w:type="separator" w:id="-1">
-    <w:p>
-      <w:pPr>
-        <w:spacing w:after="0" w:line="240" w:lineRule="auto"/>
-      </w:pPr>
-      <w:r>
-        <w:separator/>
-      </w:r>
-    </w:p>
-  </w:endnote>
-  <w:endnote w:type="continuationSeparator" w:id="0">
-    <w:p>
-      <w:pPr>
-        <w:spacing w:after="0" w:line="240" w:lineRule="auto"/>
-      </w:pPr>
-      <w:r>
-        <w:continuationSeparator/>
-      </w:r>
-    </w:p>
-  </w:endnote>
-</w:endnotes>
-</file>
-
-<file path=word/footnotes.xml><?xml version="1.0" encoding="utf-8"?>
-<w:footnotes xmlns:wpc="http://schemas.microsoft.com/office/word/2010/wordprocessingCanvas" xmlns:cx="http://schemas.microsoft.com/office/drawing/2014/chartex" xmlns:cx1="http://schemas.microsoft.com/office/drawing/2015/9/8/chartex" xmlns:cx2="http://schemas.microsoft.com/office/drawing/2015/10/21/chartex" xmlns:cx3="http://schemas.microsoft.com/office/drawing/2016/5/9/chartex" xmlns:cx4="http://schemas.microsoft.com/office/drawing/2016/5/10/chartex" xmlns:cx5="http://schemas.microsoft.com/office/drawing/2016/5/11/chartex" xmlns:cx6="http://schemas.microsoft.com/office/drawing/2016/5/12/chartex" xmlns:cx7="http://schemas.microsoft.com/office/drawing/2016/5/13/chartex" xmlns:cx8="http://schemas.microsoft.com/office/drawing/2016/5/14/chartex" xmlns:mc="http://schemas.openxmlformats.org/markup-compatibility/2006" xmlns:m="http://schemas.openxmlformats.org/officeDocument/2006/math" xmlns:aink="http://schemas.microsoft.com/office/drawing/2016/ink" xmlns:am3d="http://schemas.microsoft.com/office/drawing/2017/model3d" xmlns:oel="http://schemas.microsoft.com/office/2019/extlst" xmlns:r="http://schemas.openxmlformats.org/officeDocument/2006/relationships" xmlns:wp14="http://schemas.microsoft.com/office/word/2010/wordprocessingDrawing" xmlns:wp="http://schemas.openxmlformats.org/drawingml/2006/wordprocessingDrawing" xmlns:wpg="http://schemas.microsoft.com/office/word/2010/wordprocessingGroup" xmlns:wpi="http://schemas.microsoft.com/office/word/2010/wordprocessingInk" xmlns:wps="http://schemas.microsoft.com/office/word/2010/wordprocessingShape" xmlns:o="urn:schemas-microsoft-com:office:office" xmlns:v="urn:schemas-microsoft-com:vml" xmlns:w10="urn:schemas-microsoft-com:office:word" xmlns:w="http://schemas.openxmlformats.org/wordprocessingml/2006/main" xmlns:w14="http://schemas.microsoft.com/office/word/2010/wordml" xmlns:w15="http://schemas.microsoft.com/office/word/2012/wordml" xmlns:w16cex="http://schemas.microsoft.com/office/word/2018/wordml/cex" xmlns:w16cid="http://schemas.microsoft.com/office/word/2016/wordml/cid" xmlns:w16="http://schemas.microsoft.com/office/word/2018/wordml" xmlns:w16sdtdh="http://schemas.microsoft.com/office/word/2020/wordml/sdtdatahash" xmlns:w16sdtfl="http://schemas.microsoft.com/office/word/2024/wordml/sdtformatlock" xmlns:w16se="http://schemas.microsoft.com/office/word/2015/wordml/symex" xmlns:w16du="http://schemas.microsoft.com/office/word/2023/wordml/word16du" xmlns:wne="http://schemas.microsoft.com/office/word/2006/wordml" mc:Ignorable="w14 w15 w16se w16cid w16 w16cex w16sdtdh w16sdtfl w16du wp14">
-  <w:footnote w:type="separator" w:id="-1">
-    <w:p>
-      <w:pPr>
-        <w:spacing w:after="0" w:line="240" w:lineRule="auto"/>
-      </w:pPr>
-      <w:r>
-        <w:separator/>
-      </w:r>
-    </w:p>
-  </w:footnote>
-  <w:footnote w:type="continuationSeparator" w:id="0">
-    <w:p>
-      <w:pPr>
-        <w:spacing w:after="0" w:line="240" w:lineRule="auto"/>
-      </w:pPr>
-      <w:r>
-        <w:continuationSeparator/>
-      </w:r>
-    </w:p>
-  </w:footnote>
-</w:footnotes>
-</file>
-
 <file path=word/numbering.xml><?xml version="1.0" encoding="utf-8"?>
 <w:numbering xmlns:wpc="http://schemas.microsoft.com/office/word/2010/wordprocessingCanvas" xmlns:cx="http://schemas.microsoft.com/office/drawing/2014/chartex" xmlns:cx1="http://schemas.microsoft.com/office/drawing/2015/9/8/chartex" xmlns:cx2="http://schemas.microsoft.com/office/drawing/2015/10/21/chartex" xmlns:cx3="http://schemas.microsoft.com/office/drawing/2016/5/9/chartex" xmlns:cx4="http://schemas.microsoft.com/office/drawing/2016/5/10/chartex" xmlns:cx5="http://schemas.microsoft.com/office/drawing/2016/5/11/chartex" xmlns:cx6="http://schemas.microsoft.com/office/drawing/2016/5/12/chartex" xmlns:cx7="http://schemas.microsoft.com/office/drawing/2016/5/13/chartex" xmlns:cx8="http://schemas.microsoft.com/office/drawing/2016/5/14/chartex" xmlns:mc="http://schemas.openxmlformats.org/markup-compatibility/2006" xmlns:m="http://schemas.openxmlformats.org/officeDocument/2006/math" xmlns:aink="http://schemas.microsoft.com/office/drawing/2016/ink" xmlns:am3d="http://schemas.microsoft.com/office/drawing/2017/model3d" xmlns:oel="http://schemas.microsoft.com/office/2019/extlst" xmlns:r="http://schemas.openxmlformats.org/officeDocument/2006/relationships" xmlns:wp14="http://schemas.microsoft.com/office/word/2010/wordprocessingDrawing" xmlns:wp="http://schemas.openxmlformats.org/drawingml/2006/wordprocessingDrawing" xmlns:wpg="http://schemas.microsoft.com/office/word/2010/wordprocessingGroup" xmlns:wpi="http://schemas.microsoft.com/office/word/2010/wordprocessingInk" xmlns:wps="http://schemas.microsoft.com/office/word/2010/wordprocessingShape" xmlns:o="urn:schemas-microsoft-com:office:office" xmlns:v="urn:schemas-microsoft-com:vml" xmlns:w10="urn:schemas-microsoft-com:office:word" xmlns:w="http://schemas.openxmlformats.org/wordprocessingml/2006/main" xmlns:w14="http://schemas.microsoft.com/office/word/2010/wordml" xmlns:w15="http://schemas.microsoft.com/office/word/2012/wordml" xmlns:w16cex="http://schemas.microsoft.com/office/word/2018/wordml/cex" xmlns:w16cid="http://schemas.microsoft.com/office/word/2016/wordml/cid" xmlns:w16="http://schemas.microsoft.com/office/word/2018/wordml" xmlns:w16sdtdh="http://schemas.microsoft.com/office/word/2020/wordml/sdtdatahash" xmlns:w16sdtfl="http://schemas.microsoft.com/office/word/2024/wordml/sdtformatlock" xmlns:w16se="http://schemas.microsoft.com/office/word/2015/wordml/symex" xmlns:w16du="http://schemas.microsoft.com/office/word/2023/wordml/word16du" xmlns:wne="http://schemas.microsoft.com/office/word/2006/wordml" mc:Ignorable="w14 w15 w16se w16cid w16 w16cex w16sdtdh w16sdtfl w16du wp14">
   <w:abstractNum w:abstractNumId="0" w15:restartNumberingAfterBreak="0">
     <w:nsid w:val="FFFFFF88"/>
     <w:multiLevelType w:val="singleLevel"/>
-    <w:tmpl w:val="C238646A"/>
+    <w:tmpl w:val="6094938C"/>
     <w:lvl w:ilvl="0">
       <w:start w:val="1"/>
       <w:numFmt w:val="decimal"/>
@@ -884,7 +845,7 @@
   <w:abstractNum w:abstractNumId="1" w15:restartNumberingAfterBreak="0">
     <w:nsid w:val="FFFFFF89"/>
     <w:multiLevelType w:val="singleLevel"/>
-    <w:tmpl w:val="68F4E996"/>
+    <w:tmpl w:val="4D5892D6"/>
     <w:lvl w:ilvl="0">
       <w:start w:val="1"/>
       <w:numFmt w:val="bullet"/>
@@ -1311,7 +1272,7 @@
   <w:style w:type="paragraph" w:default="1" w:styleId="Normal">
     <w:name w:val="Normal"/>
     <w:qFormat/>
-    <w:rsid w:val="00DE7903"/>
+    <w:rsid w:val="00F0169F"/>
     <w:pPr>
       <w:spacing w:after="200" w:line="276" w:lineRule="auto"/>
     </w:pPr>
@@ -1331,7 +1292,7 @@
     <w:link w:val="Heading1Char"/>
     <w:uiPriority w:val="9"/>
     <w:qFormat/>
-    <w:rsid w:val="00DE7903"/>
+    <w:rsid w:val="00F0169F"/>
     <w:pPr>
       <w:keepNext/>
       <w:keepLines/>
@@ -1354,7 +1315,7 @@
     <w:semiHidden/>
     <w:unhideWhenUsed/>
     <w:qFormat/>
-    <w:rsid w:val="00DE7903"/>
+    <w:rsid w:val="00F0169F"/>
     <w:pPr>
       <w:keepNext/>
       <w:keepLines/>
@@ -1377,7 +1338,7 @@
     <w:semiHidden/>
     <w:unhideWhenUsed/>
     <w:qFormat/>
-    <w:rsid w:val="00DE7903"/>
+    <w:rsid w:val="00F0169F"/>
     <w:pPr>
       <w:keepNext/>
       <w:keepLines/>
@@ -1400,7 +1361,7 @@
     <w:semiHidden/>
     <w:unhideWhenUsed/>
     <w:qFormat/>
-    <w:rsid w:val="00DE7903"/>
+    <w:rsid w:val="00F0169F"/>
     <w:pPr>
       <w:keepNext/>
       <w:keepLines/>
@@ -1423,7 +1384,7 @@
     <w:semiHidden/>
     <w:unhideWhenUsed/>
     <w:qFormat/>
-    <w:rsid w:val="00DE7903"/>
+    <w:rsid w:val="00F0169F"/>
     <w:pPr>
       <w:keepNext/>
       <w:keepLines/>
@@ -1444,7 +1405,7 @@
     <w:semiHidden/>
     <w:unhideWhenUsed/>
     <w:qFormat/>
-    <w:rsid w:val="00DE7903"/>
+    <w:rsid w:val="00F0169F"/>
     <w:pPr>
       <w:keepNext/>
       <w:keepLines/>
@@ -1467,7 +1428,7 @@
     <w:semiHidden/>
     <w:unhideWhenUsed/>
     <w:qFormat/>
-    <w:rsid w:val="00DE7903"/>
+    <w:rsid w:val="00F0169F"/>
     <w:pPr>
       <w:keepNext/>
       <w:keepLines/>
@@ -1488,7 +1449,7 @@
     <w:semiHidden/>
     <w:unhideWhenUsed/>
     <w:qFormat/>
-    <w:rsid w:val="00DE7903"/>
+    <w:rsid w:val="00F0169F"/>
     <w:pPr>
       <w:keepNext/>
       <w:keepLines/>
@@ -1511,7 +1472,7 @@
     <w:semiHidden/>
     <w:unhideWhenUsed/>
     <w:qFormat/>
-    <w:rsid w:val="00DE7903"/>
+    <w:rsid w:val="00F0169F"/>
     <w:pPr>
       <w:keepNext/>
       <w:keepLines/>
@@ -1555,7 +1516,7 @@
     <w:basedOn w:val="DefaultParagraphFont"/>
     <w:link w:val="Heading1"/>
     <w:uiPriority w:val="9"/>
-    <w:rsid w:val="00DE7903"/>
+    <w:rsid w:val="00F0169F"/>
     <w:rPr>
       <w:rFonts w:asciiTheme="majorHAnsi" w:eastAsiaTheme="majorEastAsia" w:hAnsiTheme="majorHAnsi" w:cstheme="majorBidi"/>
       <w:color w:val="0F4761" w:themeColor="accent1" w:themeShade="BF"/>
@@ -1569,7 +1530,7 @@
     <w:link w:val="Heading2"/>
     <w:uiPriority w:val="9"/>
     <w:semiHidden/>
-    <w:rsid w:val="00DE7903"/>
+    <w:rsid w:val="00F0169F"/>
     <w:rPr>
       <w:rFonts w:asciiTheme="majorHAnsi" w:eastAsiaTheme="majorEastAsia" w:hAnsiTheme="majorHAnsi" w:cstheme="majorBidi"/>
       <w:color w:val="0F4761" w:themeColor="accent1" w:themeShade="BF"/>
@@ -1583,7 +1544,7 @@
     <w:link w:val="Heading3"/>
     <w:uiPriority w:val="9"/>
     <w:semiHidden/>
-    <w:rsid w:val="00DE7903"/>
+    <w:rsid w:val="00F0169F"/>
     <w:rPr>
       <w:rFonts w:eastAsiaTheme="majorEastAsia" w:cstheme="majorBidi"/>
       <w:color w:val="0F4761" w:themeColor="accent1" w:themeShade="BF"/>
@@ -1597,7 +1558,7 @@
     <w:link w:val="Heading4"/>
     <w:uiPriority w:val="9"/>
     <w:semiHidden/>
-    <w:rsid w:val="00DE7903"/>
+    <w:rsid w:val="00F0169F"/>
     <w:rPr>
       <w:rFonts w:eastAsiaTheme="majorEastAsia" w:cstheme="majorBidi"/>
       <w:i/>
@@ -1611,7 +1572,7 @@
     <w:link w:val="Heading5"/>
     <w:uiPriority w:val="9"/>
     <w:semiHidden/>
-    <w:rsid w:val="00DE7903"/>
+    <w:rsid w:val="00F0169F"/>
     <w:rPr>
       <w:rFonts w:eastAsiaTheme="majorEastAsia" w:cstheme="majorBidi"/>
       <w:color w:val="0F4761" w:themeColor="accent1" w:themeShade="BF"/>
@@ -1623,7 +1584,7 @@
     <w:link w:val="Heading6"/>
     <w:uiPriority w:val="9"/>
     <w:semiHidden/>
-    <w:rsid w:val="00DE7903"/>
+    <w:rsid w:val="00F0169F"/>
     <w:rPr>
       <w:rFonts w:eastAsiaTheme="majorEastAsia" w:cstheme="majorBidi"/>
       <w:i/>
@@ -1637,7 +1598,7 @@
     <w:link w:val="Heading7"/>
     <w:uiPriority w:val="9"/>
     <w:semiHidden/>
-    <w:rsid w:val="00DE7903"/>
+    <w:rsid w:val="00F0169F"/>
     <w:rPr>
       <w:rFonts w:eastAsiaTheme="majorEastAsia" w:cstheme="majorBidi"/>
       <w:color w:val="595959" w:themeColor="text1" w:themeTint="A6"/>
@@ -1649,7 +1610,7 @@
     <w:link w:val="Heading8"/>
     <w:uiPriority w:val="9"/>
     <w:semiHidden/>
-    <w:rsid w:val="00DE7903"/>
+    <w:rsid w:val="00F0169F"/>
     <w:rPr>
       <w:rFonts w:eastAsiaTheme="majorEastAsia" w:cstheme="majorBidi"/>
       <w:i/>
@@ -1663,7 +1624,7 @@
     <w:link w:val="Heading9"/>
     <w:uiPriority w:val="9"/>
     <w:semiHidden/>
-    <w:rsid w:val="00DE7903"/>
+    <w:rsid w:val="00F0169F"/>
     <w:rPr>
       <w:rFonts w:eastAsiaTheme="majorEastAsia" w:cstheme="majorBidi"/>
       <w:color w:val="272727" w:themeColor="text1" w:themeTint="D8"/>
@@ -1676,7 +1637,7 @@
     <w:link w:val="TitleChar"/>
     <w:uiPriority w:val="10"/>
     <w:qFormat/>
-    <w:rsid w:val="00DE7903"/>
+    <w:rsid w:val="00F0169F"/>
     <w:pPr>
       <w:spacing w:after="80" w:line="240" w:lineRule="auto"/>
       <w:contextualSpacing/>
@@ -1694,7 +1655,7 @@
     <w:basedOn w:val="DefaultParagraphFont"/>
     <w:link w:val="Title"/>
     <w:uiPriority w:val="10"/>
-    <w:rsid w:val="00DE7903"/>
+    <w:rsid w:val="00F0169F"/>
     <w:rPr>
       <w:rFonts w:asciiTheme="majorHAnsi" w:eastAsiaTheme="majorEastAsia" w:hAnsiTheme="majorHAnsi" w:cstheme="majorBidi"/>
       <w:spacing w:val="-10"/>
@@ -1710,7 +1671,7 @@
     <w:link w:val="SubtitleChar"/>
     <w:uiPriority w:val="11"/>
     <w:qFormat/>
-    <w:rsid w:val="00DE7903"/>
+    <w:rsid w:val="00F0169F"/>
     <w:pPr>
       <w:numPr>
         <w:ilvl w:val="1"/>
@@ -1729,7 +1690,7 @@
     <w:basedOn w:val="DefaultParagraphFont"/>
     <w:link w:val="Subtitle"/>
     <w:uiPriority w:val="11"/>
-    <w:rsid w:val="00DE7903"/>
+    <w:rsid w:val="00F0169F"/>
     <w:rPr>
       <w:rFonts w:eastAsiaTheme="majorEastAsia" w:cstheme="majorBidi"/>
       <w:color w:val="595959" w:themeColor="text1" w:themeTint="A6"/>
@@ -1745,7 +1706,7 @@
     <w:link w:val="QuoteChar"/>
     <w:uiPriority w:val="29"/>
     <w:qFormat/>
-    <w:rsid w:val="00DE7903"/>
+    <w:rsid w:val="00F0169F"/>
     <w:pPr>
       <w:spacing w:before="160"/>
       <w:jc w:val="center"/>
@@ -1761,7 +1722,7 @@
     <w:basedOn w:val="DefaultParagraphFont"/>
     <w:link w:val="Quote"/>
     <w:uiPriority w:val="29"/>
-    <w:rsid w:val="00DE7903"/>
+    <w:rsid w:val="00F0169F"/>
     <w:rPr>
       <w:i/>
       <w:iCs/>
@@ -1773,7 +1734,7 @@
     <w:basedOn w:val="Normal"/>
     <w:uiPriority w:val="34"/>
     <w:qFormat/>
-    <w:rsid w:val="00DE7903"/>
+    <w:rsid w:val="00F0169F"/>
     <w:pPr>
       <w:ind w:left="720"/>
       <w:contextualSpacing/>
@@ -1784,7 +1745,7 @@
     <w:basedOn w:val="DefaultParagraphFont"/>
     <w:uiPriority w:val="21"/>
     <w:qFormat/>
-    <w:rsid w:val="00DE7903"/>
+    <w:rsid w:val="00F0169F"/>
     <w:rPr>
       <w:i/>
       <w:iCs/>
@@ -1798,7 +1759,7 @@
     <w:link w:val="IntenseQuoteChar"/>
     <w:uiPriority w:val="30"/>
     <w:qFormat/>
-    <w:rsid w:val="00DE7903"/>
+    <w:rsid w:val="00F0169F"/>
     <w:pPr>
       <w:pBdr>
         <w:top w:val="single" w:sz="4" w:space="10" w:color="0F4761" w:themeColor="accent1" w:themeShade="BF"/>
@@ -1819,7 +1780,7 @@
     <w:basedOn w:val="DefaultParagraphFont"/>
     <w:link w:val="IntenseQuote"/>
     <w:uiPriority w:val="30"/>
-    <w:rsid w:val="00DE7903"/>
+    <w:rsid w:val="00F0169F"/>
     <w:rPr>
       <w:i/>
       <w:iCs/>
@@ -1831,7 +1792,7 @@
     <w:basedOn w:val="DefaultParagraphFont"/>
     <w:uiPriority w:val="32"/>
     <w:qFormat/>
-    <w:rsid w:val="00DE7903"/>
+    <w:rsid w:val="00F0169F"/>
     <w:rPr>
       <w:b/>
       <w:bCs/>
@@ -1845,7 +1806,7 @@
     <w:basedOn w:val="Normal"/>
     <w:uiPriority w:val="99"/>
     <w:unhideWhenUsed/>
-    <w:rsid w:val="00DE7903"/>
+    <w:rsid w:val="00F0169F"/>
     <w:pPr>
       <w:numPr>
         <w:numId w:val="1"/>
@@ -1862,7 +1823,7 @@
     <w:basedOn w:val="Normal"/>
     <w:uiPriority w:val="99"/>
     <w:unhideWhenUsed/>
-    <w:rsid w:val="00DE7903"/>
+    <w:rsid w:val="00F0169F"/>
     <w:pPr>
       <w:numPr>
         <w:numId w:val="2"/>
@@ -1878,7 +1839,7 @@
     <w:name w:val="Light Grid Accent 1"/>
     <w:basedOn w:val="TableNormal"/>
     <w:uiPriority w:val="62"/>
-    <w:rsid w:val="00DE7903"/>
+    <w:rsid w:val="00F0169F"/>
     <w:pPr>
       <w:spacing w:after="0" w:line="240" w:lineRule="auto"/>
     </w:pPr>
@@ -2004,66 +1965,6 @@
         </w:tcBorders>
       </w:tcPr>
     </w:tblStylePr>
-  </w:style>
-  <w:style w:type="paragraph" w:styleId="Header">
-    <w:name w:val="header"/>
-    <w:basedOn w:val="Normal"/>
-    <w:link w:val="HeaderChar"/>
-    <w:uiPriority w:val="99"/>
-    <w:unhideWhenUsed/>
-    <w:rsid w:val="00DE7903"/>
-    <w:pPr>
-      <w:tabs>
-        <w:tab w:val="center" w:pos="4680"/>
-        <w:tab w:val="right" w:pos="9360"/>
-      </w:tabs>
-      <w:spacing w:after="0" w:line="240" w:lineRule="auto"/>
-    </w:pPr>
-  </w:style>
-  <w:style w:type="character" w:customStyle="1" w:styleId="HeaderChar">
-    <w:name w:val="Header Char"/>
-    <w:basedOn w:val="DefaultParagraphFont"/>
-    <w:link w:val="Header"/>
-    <w:uiPriority w:val="99"/>
-    <w:rsid w:val="00DE7903"/>
-    <w:rPr>
-      <w:rFonts w:ascii="Calibri" w:eastAsiaTheme="minorEastAsia" w:hAnsi="Calibri"/>
-      <w:kern w:val="0"/>
-      <w:sz w:val="22"/>
-      <w:szCs w:val="22"/>
-      <w:lang w:val="en-US" w:bidi="ar-SA"/>
-      <w14:ligatures w14:val="none"/>
-    </w:rPr>
-  </w:style>
-  <w:style w:type="paragraph" w:styleId="Footer">
-    <w:name w:val="footer"/>
-    <w:basedOn w:val="Normal"/>
-    <w:link w:val="FooterChar"/>
-    <w:uiPriority w:val="99"/>
-    <w:unhideWhenUsed/>
-    <w:rsid w:val="00DE7903"/>
-    <w:pPr>
-      <w:tabs>
-        <w:tab w:val="center" w:pos="4680"/>
-        <w:tab w:val="right" w:pos="9360"/>
-      </w:tabs>
-      <w:spacing w:after="0" w:line="240" w:lineRule="auto"/>
-    </w:pPr>
-  </w:style>
-  <w:style w:type="character" w:customStyle="1" w:styleId="FooterChar">
-    <w:name w:val="Footer Char"/>
-    <w:basedOn w:val="DefaultParagraphFont"/>
-    <w:link w:val="Footer"/>
-    <w:uiPriority w:val="99"/>
-    <w:rsid w:val="00DE7903"/>
-    <w:rPr>
-      <w:rFonts w:ascii="Calibri" w:eastAsiaTheme="minorEastAsia" w:hAnsi="Calibri"/>
-      <w:kern w:val="0"/>
-      <w:sz w:val="22"/>
-      <w:szCs w:val="22"/>
-      <w:lang w:val="en-US" w:bidi="ar-SA"/>
-      <w14:ligatures w14:val="none"/>
-    </w:rPr>
   </w:style>
 </w:styles>
 </file>

</xml_diff>